<commit_message>
Add 12 euro in High end gins
</commit_message>
<xml_diff>
--- a/paraskinio-catalogue-2026-2.docx
+++ b/paraskinio-catalogue-2026-2.docx
@@ -2972,25 +2972,7 @@
                 <w:sz w:val="18"/>
                 <w:szCs w:val="18"/>
               </w:rPr>
-              <w:t xml:space="preserve">*** Tanqueray, Tanqueray </w:t>
-            </w:r>
-            <w:r>
-              <w:rPr>
-                <w:color w:val="363435"/>
-                <w:position w:val="-1"/>
-                <w:sz w:val="18"/>
-                <w:szCs w:val="18"/>
-              </w:rPr>
-              <w:t xml:space="preserve">0% Alcohol free </w:t>
-            </w:r>
-            <w:r>
-              <w:rPr>
-                <w:color w:val="363435"/>
-                <w:position w:val="-1"/>
-                <w:sz w:val="18"/>
-                <w:szCs w:val="18"/>
-              </w:rPr>
-              <w:t>...............................................................</w:t>
+              <w:t>*** Tanqueray, Tanqueray 0% Alcohol free ...............................................................</w:t>
             </w:r>
           </w:p>
         </w:tc>
@@ -3218,25 +3200,7 @@
                 <w:sz w:val="18"/>
                 <w:szCs w:val="18"/>
               </w:rPr>
-              <w:t>1</w:t>
-            </w:r>
-            <w:r>
-              <w:rPr>
-                <w:color w:val="363435"/>
-                <w:position w:val="-1"/>
-                <w:sz w:val="18"/>
-                <w:szCs w:val="18"/>
-              </w:rPr>
-              <w:t>2</w:t>
-            </w:r>
-            <w:r>
-              <w:rPr>
-                <w:color w:val="363435"/>
-                <w:position w:val="-1"/>
-                <w:sz w:val="18"/>
-                <w:szCs w:val="18"/>
-              </w:rPr>
-              <w:t>,00</w:t>
+              <w:t>12,00</w:t>
             </w:r>
           </w:p>
         </w:tc>
@@ -12400,25 +12364,7 @@
                 <w:sz w:val="18"/>
                 <w:szCs w:val="18"/>
               </w:rPr>
-              <w:t xml:space="preserve">*** Tanqueray, Tanqueray </w:t>
-            </w:r>
-            <w:r>
-              <w:rPr>
-                <w:color w:val="363435"/>
-                <w:position w:val="-1"/>
-                <w:sz w:val="18"/>
-                <w:szCs w:val="18"/>
-              </w:rPr>
-              <w:t xml:space="preserve">0% Alcohol free </w:t>
-            </w:r>
-            <w:r>
-              <w:rPr>
-                <w:color w:val="363435"/>
-                <w:position w:val="-1"/>
-                <w:sz w:val="18"/>
-                <w:szCs w:val="18"/>
-              </w:rPr>
-              <w:t>...............................................................</w:t>
+              <w:t>*** Tanqueray, Tanqueray 0% Alcohol free ...............................................................</w:t>
             </w:r>
           </w:p>
         </w:tc>
@@ -12646,7 +12592,25 @@
                 <w:sz w:val="18"/>
                 <w:szCs w:val="18"/>
               </w:rPr>
-              <w:t>10,00</w:t>
+              <w:t>1</w:t>
+            </w:r>
+            <w:r>
+              <w:rPr>
+                <w:color w:val="363435"/>
+                <w:position w:val="-1"/>
+                <w:sz w:val="18"/>
+                <w:szCs w:val="18"/>
+              </w:rPr>
+              <w:t>2</w:t>
+            </w:r>
+            <w:r>
+              <w:rPr>
+                <w:color w:val="363435"/>
+                <w:position w:val="-1"/>
+                <w:sz w:val="18"/>
+                <w:szCs w:val="18"/>
+              </w:rPr>
+              <w:t>,00</w:t>
             </w:r>
           </w:p>
         </w:tc>

</xml_diff>

<commit_message>
Daily pie 4,5 euro
</commit_message>
<xml_diff>
--- a/paraskinio-catalogue-2026-2.docx
+++ b/paraskinio-catalogue-2026-2.docx
@@ -8591,7 +8591,28 @@
                 <w:sz w:val="18"/>
                 <w:szCs w:val="18"/>
               </w:rPr>
-              <w:t>5,00</w:t>
+              <w:t>4</w:t>
+            </w:r>
+            <w:r>
+              <w:rPr>
+                <w:sz w:val="18"/>
+                <w:szCs w:val="18"/>
+              </w:rPr>
+              <w:t>,</w:t>
+            </w:r>
+            <w:r>
+              <w:rPr>
+                <w:sz w:val="18"/>
+                <w:szCs w:val="18"/>
+              </w:rPr>
+              <w:t>5</w:t>
+            </w:r>
+            <w:r>
+              <w:rPr>
+                <w:sz w:val="18"/>
+                <w:szCs w:val="18"/>
+              </w:rPr>
+              <w:t>0</w:t>
             </w:r>
           </w:p>
         </w:tc>
@@ -12592,25 +12613,7 @@
                 <w:sz w:val="18"/>
                 <w:szCs w:val="18"/>
               </w:rPr>
-              <w:t>1</w:t>
-            </w:r>
-            <w:r>
-              <w:rPr>
-                <w:color w:val="363435"/>
-                <w:position w:val="-1"/>
-                <w:sz w:val="18"/>
-                <w:szCs w:val="18"/>
-              </w:rPr>
-              <w:t>2</w:t>
-            </w:r>
-            <w:r>
-              <w:rPr>
-                <w:color w:val="363435"/>
-                <w:position w:val="-1"/>
-                <w:sz w:val="18"/>
-                <w:szCs w:val="18"/>
-              </w:rPr>
-              <w:t>,00</w:t>
+              <w:t>12,00</w:t>
             </w:r>
           </w:p>
         </w:tc>
@@ -17728,7 +17731,28 @@
                 <w:sz w:val="18"/>
                 <w:szCs w:val="18"/>
               </w:rPr>
-              <w:t>5,00</w:t>
+              <w:t>4</w:t>
+            </w:r>
+            <w:r>
+              <w:rPr>
+                <w:sz w:val="18"/>
+                <w:szCs w:val="18"/>
+              </w:rPr>
+              <w:t>,</w:t>
+            </w:r>
+            <w:r>
+              <w:rPr>
+                <w:sz w:val="18"/>
+                <w:szCs w:val="18"/>
+              </w:rPr>
+              <w:t>5</w:t>
+            </w:r>
+            <w:r>
+              <w:rPr>
+                <w:sz w:val="18"/>
+                <w:szCs w:val="18"/>
+              </w:rPr>
+              <w:t>0</w:t>
             </w:r>
           </w:p>
         </w:tc>

</xml_diff>

<commit_message>
Update Ginger, Cold Tea
</commit_message>
<xml_diff>
--- a/paraskinio-catalogue-2026-2.docx
+++ b/paraskinio-catalogue-2026-2.docx
@@ -5341,7 +5341,31 @@
                 <w:sz w:val="18"/>
                 <w:szCs w:val="18"/>
               </w:rPr>
-              <w:t>3,50</w:t>
+              <w:t>4</w:t>
+            </w:r>
+            <w:r>
+              <w:rPr>
+                <w:color w:val="363435"/>
+                <w:sz w:val="18"/>
+                <w:szCs w:val="18"/>
+              </w:rPr>
+              <w:t>,</w:t>
+            </w:r>
+            <w:r>
+              <w:rPr>
+                <w:color w:val="363435"/>
+                <w:sz w:val="18"/>
+                <w:szCs w:val="18"/>
+              </w:rPr>
+              <w:t>0</w:t>
+            </w:r>
+            <w:r>
+              <w:rPr>
+                <w:color w:val="363435"/>
+                <w:sz w:val="18"/>
+                <w:szCs w:val="18"/>
+              </w:rPr>
+              <w:t>0</w:t>
             </w:r>
           </w:p>
         </w:tc>
@@ -6244,7 +6268,7 @@
                 <w:sz w:val="18"/>
                 <w:szCs w:val="18"/>
               </w:rPr>
-              <w:t>4,</w:t>
+              <w:t>5,</w:t>
             </w:r>
             <w:r>
               <w:rPr>
@@ -8591,28 +8615,7 @@
                 <w:sz w:val="18"/>
                 <w:szCs w:val="18"/>
               </w:rPr>
-              <w:t>4</w:t>
-            </w:r>
-            <w:r>
-              <w:rPr>
-                <w:sz w:val="18"/>
-                <w:szCs w:val="18"/>
-              </w:rPr>
-              <w:t>,</w:t>
-            </w:r>
-            <w:r>
-              <w:rPr>
-                <w:sz w:val="18"/>
-                <w:szCs w:val="18"/>
-              </w:rPr>
-              <w:t>5</w:t>
-            </w:r>
-            <w:r>
-              <w:rPr>
-                <w:sz w:val="18"/>
-                <w:szCs w:val="18"/>
-              </w:rPr>
-              <w:t>0</w:t>
+              <w:t>4,50</w:t>
             </w:r>
           </w:p>
         </w:tc>
@@ -14552,7 +14555,31 @@
                 <w:sz w:val="18"/>
                 <w:szCs w:val="18"/>
               </w:rPr>
-              <w:t>3,50</w:t>
+              <w:t>4</w:t>
+            </w:r>
+            <w:r>
+              <w:rPr>
+                <w:color w:val="363435"/>
+                <w:sz w:val="18"/>
+                <w:szCs w:val="18"/>
+              </w:rPr>
+              <w:t>,</w:t>
+            </w:r>
+            <w:r>
+              <w:rPr>
+                <w:color w:val="363435"/>
+                <w:sz w:val="18"/>
+                <w:szCs w:val="18"/>
+              </w:rPr>
+              <w:t>0</w:t>
+            </w:r>
+            <w:r>
+              <w:rPr>
+                <w:color w:val="363435"/>
+                <w:sz w:val="18"/>
+                <w:szCs w:val="18"/>
+              </w:rPr>
+              <w:t>0</w:t>
             </w:r>
           </w:p>
         </w:tc>
@@ -15411,7 +15438,7 @@
                 <w:sz w:val="18"/>
                 <w:szCs w:val="18"/>
               </w:rPr>
-              <w:t>4,</w:t>
+              <w:t>5,</w:t>
             </w:r>
             <w:r>
               <w:rPr>
@@ -17731,28 +17758,7 @@
                 <w:sz w:val="18"/>
                 <w:szCs w:val="18"/>
               </w:rPr>
-              <w:t>4</w:t>
-            </w:r>
-            <w:r>
-              <w:rPr>
-                <w:sz w:val="18"/>
-                <w:szCs w:val="18"/>
-              </w:rPr>
-              <w:t>,</w:t>
-            </w:r>
-            <w:r>
-              <w:rPr>
-                <w:sz w:val="18"/>
-                <w:szCs w:val="18"/>
-              </w:rPr>
-              <w:t>5</w:t>
-            </w:r>
-            <w:r>
-              <w:rPr>
-                <w:sz w:val="18"/>
-                <w:szCs w:val="18"/>
-              </w:rPr>
-              <w:t>0</w:t>
+              <w:t>4,50</w:t>
             </w:r>
           </w:p>
         </w:tc>

</xml_diff>